<commit_message>
feat: harmonise les formats et centralise les jetons couleur (1.2.0)
- jetons couleur générés depuis le design system (sources/tokens.json,
  outils/generer_jetons.py) pour les thèmes SCSS, le gabarit Typst et
  les scripts Python
- PDF : texte en Marianne fournie par l'extension (plus d'avertissement
  « liberation sans »), titres en Arial, pagination après la couverture
- tableaux au modèle du PDF (en-tête indigo, lignes alternées) en Word et
  en HTML
- Word : titres comme le PDF, sans filet corail ; couleurs des titres
  rétablies (supprimées par python-docx) ; encadrés au style du PDF
- HTML : sans barre ni filet corail sur les titres, contenu élargi
- PowerPoint : tableaux numérotés rendus avec légende et renvois ;
  disposition texte puis objet en pleine largeur ; renvois en français
- workflow GitHub de rendu des cinq formats

Co-Authored-By: Claude Opus 5.5 <noreply@anthropic.com>
Claude-Session: https://claude.ai/code/session_0113azZoow6df3twQjnrUvLH
</commit_message>
<xml_diff>
--- a/_extensions/cerema/reference.docx
+++ b/_extensions/cerema/reference.docx
@@ -761,6 +761,7 @@
       <w:rFonts w:ascii="Marianne" w:hAnsi="Marianne" w:cs="Marianne" w:eastAsia="Marianne"/>
       <w:b w:val="0"/>
       <w:i w:val="0"/>
+      <w:color w:val="000000"/>
       <w:sz w:val="22"/>
     </w:rPr>
   </w:style>
@@ -776,6 +777,7 @@
       <w:rFonts w:ascii="Marianne" w:hAnsi="Marianne" w:cs="Marianne" w:eastAsia="Marianne"/>
       <w:b w:val="0"/>
       <w:i w:val="0"/>
+      <w:color w:val="000000"/>
       <w:sz w:val="22"/>
     </w:rPr>
   </w:style>
@@ -791,6 +793,7 @@
       <w:rFonts w:ascii="Marianne" w:hAnsi="Marianne" w:cs="Marianne" w:eastAsia="Marianne"/>
       <w:b w:val="0"/>
       <w:i w:val="0"/>
+      <w:color w:val="000000"/>
       <w:sz w:val="22"/>
     </w:rPr>
   </w:style>
@@ -805,6 +808,7 @@
       <w:rFonts w:ascii="Marianne" w:hAnsi="Marianne" w:cs="Marianne" w:eastAsia="Marianne"/>
       <w:b w:val="0"/>
       <w:i w:val="0"/>
+      <w:color w:val="000000"/>
       <w:sz w:val="22"/>
     </w:rPr>
   </w:style>
@@ -820,14 +824,12 @@
       <w:spacing w:after="240" w:line="240" w:lineRule="auto" w:before="0"/>
       <w:contextualSpacing/>
       <w:jc w:val="left"/>
-      <w:pBdr>
-        <w:bottom w:val="single" w:sz="24" w:space="8" w:color="EF7757"/>
-      </w:pBdr>
     </w:pPr>
     <w:rPr>
       <w:rFonts w:ascii="Arial" w:hAnsi="Arial" w:cs="Arial" w:eastAsia="Arial"/>
       <w:b/>
       <w:i w:val="0"/>
+      <w:color w:val="282474"/>
       <w:sz w:val="52"/>
       <w:szCs w:val="56"/>
     </w:rPr>
@@ -862,6 +864,7 @@
       <w:rFonts w:ascii="Marianne" w:hAnsi="Marianne" w:cs="Marianne" w:eastAsia="Marianne"/>
       <w:b w:val="0"/>
       <w:i w:val="0"/>
+      <w:color w:val="282474"/>
       <w:spacing w:val="15"/>
       <w:sz w:val="32"/>
       <w:szCs w:val="28"/>
@@ -895,6 +898,7 @@
       <w:rFonts w:ascii="Marianne" w:hAnsi="Marianne" w:cs="Marianne" w:eastAsia="Marianne"/>
       <w:b w:val="0"/>
       <w:i w:val="0"/>
+      <w:color w:val="000000"/>
       <w:sz w:val="22"/>
       <w:szCs w:val="24"/>
     </w:rPr>
@@ -913,6 +917,7 @@
       <w:rFonts w:ascii="Marianne" w:hAnsi="Marianne" w:cs="Marianne" w:eastAsia="Marianne"/>
       <w:b w:val="0"/>
       <w:i w:val="0"/>
+      <w:color w:val="000000"/>
       <w:sz w:val="22"/>
       <w:szCs w:val="24"/>
     </w:rPr>
@@ -932,6 +937,7 @@
       <w:rFonts w:ascii="Arial" w:hAnsi="Arial" w:cs="Arial" w:eastAsia="Arial"/>
       <w:b/>
       <w:i w:val="0"/>
+      <w:color w:val="282474"/>
       <w:sz w:val="24"/>
       <w:szCs w:val="20"/>
     </w:rPr>
@@ -950,6 +956,7 @@
       <w:rFonts w:ascii="Marianne" w:hAnsi="Marianne" w:cs="Marianne" w:eastAsia="Marianne"/>
       <w:b w:val="0"/>
       <w:i w:val="0"/>
+      <w:color w:val="000000"/>
       <w:sz w:val="20"/>
       <w:szCs w:val="20"/>
     </w:rPr>
@@ -975,16 +982,14 @@
       <w:keepLines/>
       <w:spacing w:before="360" w:after="120"/>
       <w:outlineLvl w:val="0"/>
-      <w:pBdr>
-        <w:left w:val="single" w:sz="48" w:space="8" w:color="EF7757"/>
-      </w:pBdr>
     </w:pPr>
     <w:rPr>
       <w:rFonts w:ascii="Arial" w:hAnsi="Arial" w:cs="Arial" w:eastAsia="Arial"/>
       <w:b/>
       <w:i w:val="0"/>
       <w:caps/>
-      <w:sz w:val="36"/>
+      <w:color w:val="282474"/>
+      <w:sz w:val="38"/>
       <w:szCs w:val="40"/>
     </w:rPr>
   </w:style>
@@ -1008,7 +1013,8 @@
       <w:rFonts w:ascii="Arial" w:hAnsi="Arial" w:cs="Arial" w:eastAsia="Arial"/>
       <w:b/>
       <w:i w:val="0"/>
-      <w:sz w:val="28"/>
+      <w:color w:val="282474"/>
+      <w:sz w:val="32"/>
       <w:szCs w:val="32"/>
     </w:rPr>
   </w:style>
@@ -1032,6 +1038,7 @@
       <w:rFonts w:ascii="Arial" w:hAnsi="Arial" w:cs="Arial" w:eastAsia="Arial"/>
       <w:b/>
       <w:i w:val="0"/>
+      <w:color w:val="282474"/>
       <w:sz w:val="24"/>
       <w:szCs w:val="28"/>
     </w:rPr>
@@ -1053,10 +1060,11 @@
       <w:outlineLvl w:val="3"/>
     </w:pPr>
     <w:rPr>
-      <w:rFonts w:ascii="Marianne" w:hAnsi="Marianne" w:cs="Marianne" w:eastAsia="Marianne"/>
-      <w:b/>
-      <w:i w:val="0"/>
+      <w:rFonts w:ascii="Arial" w:hAnsi="Arial" w:cs="Arial" w:eastAsia="Arial"/>
+      <w:b w:val="0"/>
+      <w:i/>
       <w:iCs/>
+      <w:color w:val="EF7757"/>
       <w:sz w:val="22"/>
     </w:rPr>
   </w:style>
@@ -1077,9 +1085,10 @@
       <w:outlineLvl w:val="4"/>
     </w:pPr>
     <w:rPr>
-      <w:rFonts w:ascii="Marianne" w:hAnsi="Marianne" w:cs="Marianne" w:eastAsia="Marianne"/>
-      <w:b/>
+      <w:rFonts w:ascii="Arial" w:hAnsi="Arial" w:cs="Arial" w:eastAsia="Arial"/>
+      <w:b w:val="0"/>
       <w:i/>
+      <w:color w:val="87888A"/>
       <w:sz w:val="22"/>
     </w:rPr>
   </w:style>
@@ -1100,10 +1109,11 @@
       <w:outlineLvl w:val="5"/>
     </w:pPr>
     <w:rPr>
-      <w:rFonts w:ascii="Marianne" w:hAnsi="Marianne" w:cs="Marianne" w:eastAsia="Marianne"/>
-      <w:b/>
+      <w:rFonts w:ascii="Arial" w:hAnsi="Arial" w:cs="Arial" w:eastAsia="Arial"/>
+      <w:b w:val="0"/>
       <w:i/>
       <w:iCs/>
+      <w:color w:val="87888A"/>
       <w:sz w:val="22"/>
     </w:rPr>
   </w:style>
@@ -1124,9 +1134,10 @@
       <w:outlineLvl w:val="6"/>
     </w:pPr>
     <w:rPr>
-      <w:rFonts w:ascii="Marianne" w:hAnsi="Marianne" w:cs="Marianne" w:eastAsia="Marianne"/>
-      <w:b/>
+      <w:rFonts w:ascii="Arial" w:hAnsi="Arial" w:cs="Arial" w:eastAsia="Arial"/>
+      <w:b w:val="0"/>
       <w:i/>
+      <w:color w:val="87888A"/>
       <w:sz w:val="22"/>
     </w:rPr>
   </w:style>
@@ -1147,10 +1158,11 @@
       <w:outlineLvl w:val="7"/>
     </w:pPr>
     <w:rPr>
-      <w:rFonts w:ascii="Marianne" w:hAnsi="Marianne" w:cs="Marianne" w:eastAsia="Marianne"/>
-      <w:b/>
+      <w:rFonts w:ascii="Arial" w:hAnsi="Arial" w:cs="Arial" w:eastAsia="Arial"/>
+      <w:b w:val="0"/>
       <w:i/>
       <w:iCs/>
+      <w:color w:val="87888A"/>
       <w:sz w:val="22"/>
     </w:rPr>
   </w:style>
@@ -1171,9 +1183,10 @@
       <w:outlineLvl w:val="8"/>
     </w:pPr>
     <w:rPr>
-      <w:rFonts w:ascii="Marianne" w:hAnsi="Marianne" w:cs="Marianne" w:eastAsia="Marianne"/>
-      <w:b/>
+      <w:rFonts w:ascii="Arial" w:hAnsi="Arial" w:cs="Arial" w:eastAsia="Arial"/>
+      <w:b w:val="0"/>
       <w:i/>
+      <w:color w:val="87888A"/>
       <w:sz w:val="22"/>
     </w:rPr>
   </w:style>
@@ -1314,6 +1327,7 @@
       <w:rFonts w:ascii="Marianne" w:hAnsi="Marianne" w:cs="Marianne" w:eastAsia="Marianne"/>
       <w:b w:val="0"/>
       <w:i/>
+      <w:color w:val="282474"/>
       <w:sz w:val="24"/>
     </w:rPr>
   </w:style>
@@ -1328,6 +1342,7 @@
       <w:rFonts w:ascii="Marianne" w:hAnsi="Marianne" w:cs="Marianne" w:eastAsia="Marianne"/>
       <w:b w:val="0"/>
       <w:i w:val="0"/>
+      <w:color w:val="000000"/>
       <w:sz w:val="18"/>
     </w:rPr>
   </w:style>
@@ -1399,6 +1414,7 @@
       <w:rFonts w:ascii="Marianne" w:hAnsi="Marianne" w:cs="Marianne" w:eastAsia="Marianne"/>
       <w:b w:val="0"/>
       <w:i w:val="0"/>
+      <w:color w:val="000000"/>
       <w:sz w:val="22"/>
     </w:rPr>
   </w:style>
@@ -1413,6 +1429,7 @@
       <w:rFonts w:ascii="Marianne" w:hAnsi="Marianne" w:cs="Marianne" w:eastAsia="Marianne"/>
       <w:b w:val="0"/>
       <w:i/>
+      <w:color w:val="000000"/>
       <w:sz w:val="18"/>
     </w:rPr>
   </w:style>
@@ -1426,6 +1443,7 @@
       <w:rFonts w:ascii="Marianne" w:hAnsi="Marianne" w:cs="Marianne" w:eastAsia="Marianne"/>
       <w:b w:val="0"/>
       <w:i/>
+      <w:color w:val="000000"/>
       <w:sz w:val="18"/>
     </w:rPr>
   </w:style>
@@ -1436,6 +1454,7 @@
       <w:rFonts w:ascii="Marianne" w:hAnsi="Marianne" w:cs="Marianne" w:eastAsia="Marianne"/>
       <w:b w:val="0"/>
       <w:i/>
+      <w:color w:val="000000"/>
       <w:sz w:val="18"/>
     </w:rPr>
   </w:style>
@@ -1477,7 +1496,9 @@
   <w:style w:type="character" w:styleId="Hyperlink">
     <w:name w:val="Hyperlink"/>
     <w:basedOn w:val="BodyTextChar"/>
-    <w:rPr/>
+    <w:rPr>
+      <w:color w:val="282474"/>
+    </w:rPr>
   </w:style>
   <w:style w:type="paragraph" w:styleId="TOCHeading">
     <w:name w:val="TOC Heading"/>
@@ -1495,6 +1516,7 @@
       <w:b/>
       <w:bCs w:val="0"/>
       <w:i w:val="0"/>
+      <w:color w:val="282474"/>
       <w:sz w:val="36"/>
     </w:rPr>
   </w:style>
@@ -1508,12 +1530,8 @@
     <w:tblPr>
       <w:tblStyleRowBandSize w:val="1"/>
       <w:tblBorders>
-        <w:top w:val="single" w:sz="8" w:space="0" w:color="FFFFFF"/>
-        <w:left w:val="single" w:sz="8" w:space="0" w:color="FFFFFF"/>
-        <w:bottom w:val="single" w:sz="8" w:space="0" w:color="FFFFFF"/>
-        <w:right w:val="single" w:sz="8" w:space="0" w:color="FFFFFF"/>
-        <w:insideH w:val="single" w:sz="8" w:space="0" w:color="FFFFFF"/>
-        <w:insideV w:val="single" w:sz="8" w:space="0" w:color="FFFFFF"/>
+        <w:bottom w:val="single" w:sz="4" w:space="0" w:color="B7B8B9"/>
+        <w:insideH w:val="single" w:sz="4" w:space="0" w:color="B7B8B9"/>
       </w:tblBorders>
       <w:tblCellMar>
         <w:top w:w="40" w:type="dxa"/>
@@ -1522,25 +1540,185 @@
         <w:right w:w="100" w:type="dxa"/>
       </w:tblCellMar>
     </w:tblPr>
-    <w:tblStylePr w:type="band1Horz">
-      <w:tcPr>
-        <w:shd w:val="clear" w:color="auto" w:fill="F2F2F2"/>
-      </w:tcPr>
-    </w:tblStylePr>
     <w:tblStylePr w:type="band2Horz">
       <w:tcPr>
-        <w:shd w:val="clear" w:color="auto" w:fill="F2F2F2"/>
+        <w:shd w:val="clear" w:color="auto" w:fill="F2F2F7"/>
       </w:tcPr>
     </w:tblStylePr>
     <w:tblStylePr w:type="firstRow">
       <w:rPr>
         <w:b/>
-        <w:color w:val="000000"/>
+        <w:color w:val="FFFFFF"/>
       </w:rPr>
       <w:tcPr>
-        <w:shd w:val="clear" w:color="auto" w:fill="EF7757"/>
+        <w:shd w:val="clear" w:color="auto" w:fill="282474"/>
       </w:tcPr>
     </w:tblStylePr>
+  </w:style>
+  <w:style w:type="paragraph" w:customStyle="1" w:styleId="Encadrénote">
+    <w:name w:val="Encadré note"/>
+    <w:basedOn w:val="BodyText"/>
+    <w:pPr>
+      <w:spacing w:before="0" w:after="0"/>
+      <w:ind w:left="170" w:right="57"/>
+      <w:pBdr>
+        <w:left w:val="single" w:sz="24" w:space="8" w:color="282474"/>
+      </w:pBdr>
+      <w:shd w:val="clear" w:color="auto" w:fill="EEEDF4"/>
+    </w:pPr>
+    <w:rPr>
+      <w:rFonts w:ascii="Marianne" w:hAnsi="Marianne" w:cs="Marianne" w:eastAsia="Marianne"/>
+      <w:b w:val="0"/>
+      <w:i w:val="0"/>
+      <w:color w:val="000000"/>
+      <w:sz w:val="21"/>
+    </w:rPr>
+  </w:style>
+  <w:style w:type="paragraph" w:customStyle="1" w:styleId="Encadrénotetitre">
+    <w:name w:val="Encadré note titre"/>
+    <w:basedOn w:val="Encadrénote"/>
+    <w:pPr>
+      <w:keepNext/>
+      <w:spacing w:before="200"/>
+    </w:pPr>
+    <w:rPr>
+      <w:b/>
+      <w:color w:val="282474"/>
+    </w:rPr>
+  </w:style>
+  <w:style w:type="paragraph" w:customStyle="1" w:styleId="Encadrétip">
+    <w:name w:val="Encadré tip"/>
+    <w:basedOn w:val="BodyText"/>
+    <w:pPr>
+      <w:spacing w:before="0" w:after="0"/>
+      <w:ind w:left="170" w:right="57"/>
+      <w:pBdr>
+        <w:left w:val="single" w:sz="24" w:space="8" w:color="448D60"/>
+      </w:pBdr>
+      <w:shd w:val="clear" w:color="auto" w:fill="F0F6F2"/>
+    </w:pPr>
+    <w:rPr>
+      <w:rFonts w:ascii="Marianne" w:hAnsi="Marianne" w:cs="Marianne" w:eastAsia="Marianne"/>
+      <w:b w:val="0"/>
+      <w:i w:val="0"/>
+      <w:color w:val="000000"/>
+      <w:sz w:val="21"/>
+    </w:rPr>
+  </w:style>
+  <w:style w:type="paragraph" w:customStyle="1" w:styleId="Encadrétiptitre">
+    <w:name w:val="Encadré tip titre"/>
+    <w:basedOn w:val="Encadrétip"/>
+    <w:pPr>
+      <w:keepNext/>
+      <w:spacing w:before="200"/>
+    </w:pPr>
+    <w:rPr>
+      <w:b/>
+      <w:color w:val="448D60"/>
+    </w:rPr>
+  </w:style>
+  <w:style w:type="paragraph" w:customStyle="1" w:styleId="Encadréwarning">
+    <w:name w:val="Encadré warning"/>
+    <w:basedOn w:val="BodyText"/>
+    <w:pPr>
+      <w:spacing w:before="0" w:after="0"/>
+      <w:ind w:left="170" w:right="57"/>
+      <w:pBdr>
+        <w:left w:val="single" w:sz="24" w:space="8" w:color="B99C45"/>
+      </w:pBdr>
+      <w:shd w:val="clear" w:color="auto" w:fill="F9F7F0"/>
+    </w:pPr>
+    <w:rPr>
+      <w:rFonts w:ascii="Marianne" w:hAnsi="Marianne" w:cs="Marianne" w:eastAsia="Marianne"/>
+      <w:b w:val="0"/>
+      <w:i w:val="0"/>
+      <w:color w:val="000000"/>
+      <w:sz w:val="21"/>
+    </w:rPr>
+  </w:style>
+  <w:style w:type="paragraph" w:customStyle="1" w:styleId="Encadréwarningtitre">
+    <w:name w:val="Encadré warning titre"/>
+    <w:basedOn w:val="Encadréwarning"/>
+    <w:pPr>
+      <w:keepNext/>
+      <w:spacing w:before="200"/>
+    </w:pPr>
+    <w:rPr>
+      <w:b/>
+      <w:color w:val="B99C45"/>
+    </w:rPr>
+  </w:style>
+  <w:style w:type="paragraph" w:customStyle="1" w:styleId="Encadréimportant">
+    <w:name w:val="Encadré important"/>
+    <w:basedOn w:val="BodyText"/>
+    <w:pPr>
+      <w:spacing w:before="0" w:after="0"/>
+      <w:ind w:left="170" w:right="57"/>
+      <w:pBdr>
+        <w:left w:val="single" w:sz="24" w:space="8" w:color="EF7757"/>
+      </w:pBdr>
+      <w:shd w:val="clear" w:color="auto" w:fill="FEF4F2"/>
+    </w:pPr>
+    <w:rPr>
+      <w:rFonts w:ascii="Marianne" w:hAnsi="Marianne" w:cs="Marianne" w:eastAsia="Marianne"/>
+      <w:b w:val="0"/>
+      <w:i w:val="0"/>
+      <w:color w:val="000000"/>
+      <w:sz w:val="21"/>
+    </w:rPr>
+  </w:style>
+  <w:style w:type="paragraph" w:customStyle="1" w:styleId="Encadréimportanttitre">
+    <w:name w:val="Encadré important titre"/>
+    <w:basedOn w:val="Encadréimportant"/>
+    <w:pPr>
+      <w:keepNext/>
+      <w:spacing w:before="200"/>
+    </w:pPr>
+    <w:rPr>
+      <w:b/>
+      <w:color w:val="EF7757"/>
+    </w:rPr>
+  </w:style>
+  <w:style w:type="paragraph" w:customStyle="1" w:styleId="Encadrécaution">
+    <w:name w:val="Encadré caution"/>
+    <w:basedOn w:val="BodyText"/>
+    <w:pPr>
+      <w:spacing w:before="0" w:after="0"/>
+      <w:ind w:left="170" w:right="57"/>
+      <w:pBdr>
+        <w:left w:val="single" w:sz="24" w:space="8" w:color="B35941"/>
+      </w:pBdr>
+      <w:shd w:val="clear" w:color="auto" w:fill="F9F2F0"/>
+    </w:pPr>
+    <w:rPr>
+      <w:rFonts w:ascii="Marianne" w:hAnsi="Marianne" w:cs="Marianne" w:eastAsia="Marianne"/>
+      <w:b w:val="0"/>
+      <w:i w:val="0"/>
+      <w:color w:val="000000"/>
+      <w:sz w:val="21"/>
+    </w:rPr>
+  </w:style>
+  <w:style w:type="paragraph" w:customStyle="1" w:styleId="Encadrécautiontitre">
+    <w:name w:val="Encadré caution titre"/>
+    <w:basedOn w:val="Encadrécaution"/>
+    <w:pPr>
+      <w:keepNext/>
+      <w:spacing w:before="200"/>
+    </w:pPr>
+    <w:rPr>
+      <w:b/>
+      <w:color w:val="B35941"/>
+    </w:rPr>
+  </w:style>
+  <w:style w:type="paragraph" w:customStyle="1" w:styleId="Encadréfin">
+    <w:name w:val="Encadré fin"/>
+    <w:basedOn w:val="BodyText"/>
+    <w:pPr>
+      <w:spacing w:before="0" w:after="80"/>
+    </w:pPr>
+    <w:rPr>
+      <w:sz w:val="8"/>
+    </w:rPr>
   </w:style>
 </w:styles>
 </file>

</xml_diff>

<commit_message>
fix: en-tête des tableaux Word en blanc gras
La couleur de la première ligne du style de tableau est ignorée par
LibreOffice : le filtre pose un style de caractère « Tableau entête »
sur le texte des cellules d'en-tête.

Co-Authored-By: Claude Opus 5.5 <noreply@anthropic.com>
Claude-Session: https://claude.ai/code/session_0113azZoow6df3twQjnrUvLH
</commit_message>
<xml_diff>
--- a/_extensions/cerema/reference.docx
+++ b/_extensions/cerema/reference.docx
@@ -1554,6 +1554,13 @@
         <w:shd w:val="clear" w:color="auto" w:fill="282474"/>
       </w:tcPr>
     </w:tblStylePr>
+  </w:style>
+  <w:style w:type="character" w:customStyle="1" w:styleId="Tableauentête">
+    <w:name w:val="Tableau entête"/>
+    <w:rPr>
+      <w:b/>
+      <w:color w:val="FFFFFF"/>
+    </w:rPr>
   </w:style>
   <w:style w:type="paragraph" w:customStyle="1" w:styleId="Encadrénote">
     <w:name w:val="Encadré note"/>

</xml_diff>